<commit_message>
Double compétence : profil sans « Finance », Agile (notions), Pack Office et Teams
Co-Authored-By: Claude Opus 5.5 <noreply@anthropic.com>
Claude-Session: https://claude.ai/code/session_01Uwm2tAGtUGTnWWMUSVQkub
</commit_message>
<xml_diff>
--- a/output/CV_NicolasQiGUO_DoubleCompetence.docx
+++ b/output/CV_NicolasQiGUO_DoubleCompetence.docx
@@ -144,7 +144,7 @@
           <w:sz w:val="19"/>
           <w:u w:val="none"/>
         </w:rPr>
-        <w:t>3 ans d'expérience au sein de grands groupes (BNP Paribas, La Poste). Pilotage de projets SI Finance de bout en bout, du recueil des besoins à la recette et au déploiement, coordination Métiers–IT et pilotage de prestataires. Double compétence fonctionnelle et technique, avec une expérience en développement low-code (Power Platform) et des bases en programmation et bases de données acquises en formation.</w:t>
+        <w:t>3 ans d'expérience au sein de grands groupes (BNP Paribas, La Poste). Pilotage de projets SI de bout en bout, du recueil des besoins à la recette et au déploiement, coordination Métiers–IT et pilotage de prestataires. Double compétence fonctionnelle et technique, avec une expérience en développement low-code (Power Platform) et des bases en programmation et bases de données acquises en formation.</w:t>
       </w:r>
     </w:p>
     <w:p>
@@ -1275,7 +1275,7 @@
         <w:tab/>
         <w:t>Cadrage, recueil des besoins, spécifications, recette, mise en production</w:t>
         <w:br/>
-        <w:t>Gouvernance (COPIL / COSUI), gestion des risques – Cycle en V, Agile, hybride</w:t>
+        <w:t>Gouvernance (COPIL / COSUI), risques – Cycle en V, hybride, Agile (notions)</w:t>
       </w:r>
     </w:p>
     <w:p>
@@ -1385,7 +1385,7 @@
           <w:u w:val="none"/>
         </w:rPr>
         <w:tab/>
-        <w:t>Power Apps, Power Automate, Power BI, SharePoint</w:t>
+        <w:t>Pack Office, Teams, SharePoint, Power Apps, Power Automate, Power BI</w:t>
       </w:r>
     </w:p>
     <w:p>

</xml_diff>